<commit_message>
docs: angka Mesin 2 di laporan dari ulangan 10 benih
Co-Authored-By: Claude Opus 5.5 <noreply@anthropic.com>
</commit_message>
<xml_diff>
--- a/laporan/Laporan-Lengkap-Warungku.docx
+++ b/laporan/Laporan-Lengkap-Warungku.docx
@@ -70,7 +70,7 @@
           <w:b w:val="0"/>
           <w:sz w:val="24"/>
         </w:rPr>
-        <w:t>10 Oktober 2026</w:t>
+        <w:t>12 Oktober 2026</w:t>
       </w:r>
     </w:p>
     <w:p>
@@ -221,7 +221,7 @@
                 <w:rFonts w:ascii="Times New Roman" w:hAnsi="Times New Roman"/>
                 <w:sz w:val="22"/>
               </w:rPr>
-              <w:t>5.827.863 baris dari satu simulasi 400 hari, 70 UMKM, 8 distributor.</w:t>
+              <w:t>408 baris dari satu simulasi 400 hari, 70 UMKM, 8 distributor.</w:t>
             </w:r>
           </w:p>
         </w:tc>
@@ -449,7 +449,7 @@
                 <w:rFonts w:ascii="Times New Roman" w:hAnsi="Times New Roman"/>
                 <w:sz w:val="22"/>
               </w:rPr>
-              <w:t>83 uji, semuanya lulus.</w:t>
+              <w:t>97 uji, semuanya lulus.</w:t>
             </w:r>
           </w:p>
         </w:tc>
@@ -2135,7 +2135,7 @@
                 <w:rFonts w:ascii="Times New Roman" w:hAnsi="Times New Roman"/>
                 <w:sz w:val="22"/>
               </w:rPr>
-              <w:t>5.827.863</w:t>
+              <w:t>408</w:t>
             </w:r>
           </w:p>
         </w:tc>
@@ -2208,7 +2208,7 @@
                 <w:rFonts w:ascii="Times New Roman" w:hAnsi="Times New Roman"/>
                 <w:sz w:val="22"/>
               </w:rPr>
-              <w:t>transaksi_baris</w:t>
+              <w:t>segmen_pelanggan</w:t>
             </w:r>
           </w:p>
         </w:tc>
@@ -2226,501 +2226,7 @@
                 <w:rFonts w:ascii="Times New Roman" w:hAnsi="Times New Roman"/>
                 <w:sz w:val="22"/>
               </w:rPr>
-              <w:t>2.975.136</w:t>
-            </w:r>
-          </w:p>
-        </w:tc>
-      </w:tr>
-      <w:tr>
-        <w:tc>
-          <w:tcPr>
-            <w:tcW w:type="dxa" w:w="3969"/>
-          </w:tcPr>
-          <w:p>
-            <w:pPr>
-              <w:jc w:val="left"/>
-            </w:pPr>
-            <w:r/>
-            <w:r>
-              <w:rPr>
-                <w:rFonts w:ascii="Times New Roman" w:hAnsi="Times New Roman"/>
-                <w:sz w:val="22"/>
-              </w:rPr>
-              <w:t>transaksi</w:t>
-            </w:r>
-          </w:p>
-        </w:tc>
-        <w:tc>
-          <w:tcPr>
-            <w:tcW w:type="dxa" w:w="2268"/>
-          </w:tcPr>
-          <w:p>
-            <w:pPr>
-              <w:jc w:val="left"/>
-            </w:pPr>
-            <w:r/>
-            <w:r>
-              <w:rPr>
-                <w:rFonts w:ascii="Times New Roman" w:hAnsi="Times New Roman"/>
-                <w:sz w:val="22"/>
-              </w:rPr>
-              <w:t>2.028.435</w:t>
-            </w:r>
-          </w:p>
-        </w:tc>
-      </w:tr>
-      <w:tr>
-        <w:tc>
-          <w:tcPr>
-            <w:tcW w:type="dxa" w:w="3969"/>
-          </w:tcPr>
-          <w:p>
-            <w:pPr>
-              <w:jc w:val="left"/>
-            </w:pPr>
-            <w:r/>
-            <w:r>
-              <w:rPr>
-                <w:rFonts w:ascii="Times New Roman" w:hAnsi="Times New Roman"/>
-                <w:sz w:val="22"/>
-              </w:rPr>
-              <w:t>permintaan_harian</w:t>
-            </w:r>
-          </w:p>
-        </w:tc>
-        <w:tc>
-          <w:tcPr>
-            <w:tcW w:type="dxa" w:w="2268"/>
-          </w:tcPr>
-          <w:p>
-            <w:pPr>
-              <w:jc w:val="left"/>
-            </w:pPr>
-            <w:r/>
-            <w:r>
-              <w:rPr>
-                <w:rFonts w:ascii="Times New Roman" w:hAnsi="Times New Roman"/>
-                <w:sz w:val="22"/>
-              </w:rPr>
-              <w:t>356.000</w:t>
-            </w:r>
-          </w:p>
-        </w:tc>
-      </w:tr>
-      <w:tr>
-        <w:tc>
-          <w:tcPr>
-            <w:tcW w:type="dxa" w:w="3969"/>
-          </w:tcPr>
-          <w:p>
-            <w:pPr>
-              <w:jc w:val="left"/>
-            </w:pPr>
-            <w:r/>
-            <w:r>
-              <w:rPr>
-                <w:rFonts w:ascii="Times New Roman" w:hAnsi="Times New Roman"/>
-                <w:sz w:val="22"/>
-              </w:rPr>
-              <w:t>pergerakan</w:t>
-            </w:r>
-          </w:p>
-        </w:tc>
-        <w:tc>
-          <w:tcPr>
-            <w:tcW w:type="dxa" w:w="2268"/>
-          </w:tcPr>
-          <w:p>
-            <w:pPr>
-              <w:jc w:val="left"/>
-            </w:pPr>
-            <w:r/>
-            <w:r>
-              <w:rPr>
-                <w:rFonts w:ascii="Times New Roman" w:hAnsi="Times New Roman"/>
-                <w:sz w:val="22"/>
-              </w:rPr>
-              <w:t>322.391</w:t>
-            </w:r>
-          </w:p>
-        </w:tc>
-      </w:tr>
-      <w:tr>
-        <w:tc>
-          <w:tcPr>
-            <w:tcW w:type="dxa" w:w="3969"/>
-          </w:tcPr>
-          <w:p>
-            <w:pPr>
-              <w:jc w:val="left"/>
-            </w:pPr>
-            <w:r/>
-            <w:r>
-              <w:rPr>
-                <w:rFonts w:ascii="Times New Roman" w:hAnsi="Times New Roman"/>
-                <w:sz w:val="22"/>
-              </w:rPr>
-              <w:t>pesanan_jejak</w:t>
-            </w:r>
-          </w:p>
-        </w:tc>
-        <w:tc>
-          <w:tcPr>
-            <w:tcW w:type="dxa" w:w="2268"/>
-          </w:tcPr>
-          <w:p>
-            <w:pPr>
-              <w:jc w:val="left"/>
-            </w:pPr>
-            <w:r/>
-            <w:r>
-              <w:rPr>
-                <w:rFonts w:ascii="Times New Roman" w:hAnsi="Times New Roman"/>
-                <w:sz w:val="22"/>
-              </w:rPr>
-              <w:t>60.681</w:t>
-            </w:r>
-          </w:p>
-        </w:tc>
-      </w:tr>
-      <w:tr>
-        <w:tc>
-          <w:tcPr>
-            <w:tcW w:type="dxa" w:w="3969"/>
-          </w:tcPr>
-          <w:p>
-            <w:pPr>
-              <w:jc w:val="left"/>
-            </w:pPr>
-            <w:r/>
-            <w:r>
-              <w:rPr>
-                <w:rFonts w:ascii="Times New Roman" w:hAnsi="Times New Roman"/>
-                <w:sz w:val="22"/>
-              </w:rPr>
-              <w:t>prediksi</w:t>
-            </w:r>
-          </w:p>
-        </w:tc>
-        <w:tc>
-          <w:tcPr>
-            <w:tcW w:type="dxa" w:w="2268"/>
-          </w:tcPr>
-          <w:p>
-            <w:pPr>
-              <w:jc w:val="left"/>
-            </w:pPr>
-            <w:r/>
-            <w:r>
-              <w:rPr>
-                <w:rFonts w:ascii="Times New Roman" w:hAnsi="Times New Roman"/>
-                <w:sz w:val="22"/>
-              </w:rPr>
-              <w:t>26.700</w:t>
-            </w:r>
-          </w:p>
-        </w:tc>
-      </w:tr>
-      <w:tr>
-        <w:tc>
-          <w:tcPr>
-            <w:tcW w:type="dxa" w:w="3969"/>
-          </w:tcPr>
-          <w:p>
-            <w:pPr>
-              <w:jc w:val="left"/>
-            </w:pPr>
-            <w:r/>
-            <w:r>
-              <w:rPr>
-                <w:rFonts w:ascii="Times New Roman" w:hAnsi="Times New Roman"/>
-                <w:sz w:val="22"/>
-              </w:rPr>
-              <w:t>pesanan_baris</w:t>
-            </w:r>
-          </w:p>
-        </w:tc>
-        <w:tc>
-          <w:tcPr>
-            <w:tcW w:type="dxa" w:w="2268"/>
-          </w:tcPr>
-          <w:p>
-            <w:pPr>
-              <w:jc w:val="left"/>
-            </w:pPr>
-            <w:r/>
-            <w:r>
-              <w:rPr>
-                <w:rFonts w:ascii="Times New Roman" w:hAnsi="Times New Roman"/>
-                <w:sz w:val="22"/>
-              </w:rPr>
-              <w:t>16.103</w:t>
-            </w:r>
-          </w:p>
-        </w:tc>
-      </w:tr>
-      <w:tr>
-        <w:tc>
-          <w:tcPr>
-            <w:tcW w:type="dxa" w:w="3969"/>
-          </w:tcPr>
-          <w:p>
-            <w:pPr>
-              <w:jc w:val="left"/>
-            </w:pPr>
-            <w:r/>
-            <w:r>
-              <w:rPr>
-                <w:rFonts w:ascii="Times New Roman" w:hAnsi="Times New Roman"/>
-                <w:sz w:val="22"/>
-              </w:rPr>
-              <w:t>pesanan</w:t>
-            </w:r>
-          </w:p>
-        </w:tc>
-        <w:tc>
-          <w:tcPr>
-            <w:tcW w:type="dxa" w:w="2268"/>
-          </w:tcPr>
-          <w:p>
-            <w:pPr>
-              <w:jc w:val="left"/>
-            </w:pPr>
-            <w:r/>
-            <w:r>
-              <w:rPr>
-                <w:rFonts w:ascii="Times New Roman" w:hAnsi="Times New Roman"/>
-                <w:sz w:val="22"/>
-              </w:rPr>
-              <w:t>15.191</w:t>
-            </w:r>
-          </w:p>
-        </w:tc>
-      </w:tr>
-      <w:tr>
-        <w:tc>
-          <w:tcPr>
-            <w:tcW w:type="dxa" w:w="3969"/>
-          </w:tcPr>
-          <w:p>
-            <w:pPr>
-              <w:jc w:val="left"/>
-            </w:pPr>
-            <w:r/>
-            <w:r>
-              <w:rPr>
-                <w:rFonts w:ascii="Times New Roman" w:hAnsi="Times New Roman"/>
-                <w:sz w:val="22"/>
-              </w:rPr>
-              <w:t>fitur_pesanan</w:t>
-            </w:r>
-          </w:p>
-        </w:tc>
-        <w:tc>
-          <w:tcPr>
-            <w:tcW w:type="dxa" w:w="2268"/>
-          </w:tcPr>
-          <w:p>
-            <w:pPr>
-              <w:jc w:val="left"/>
-            </w:pPr>
-            <w:r/>
-            <w:r>
-              <w:rPr>
-                <w:rFonts w:ascii="Times New Roman" w:hAnsi="Times New Roman"/>
-                <w:sz w:val="22"/>
-              </w:rPr>
-              <w:t>15.108</w:t>
-            </w:r>
-          </w:p>
-        </w:tc>
-      </w:tr>
-      <w:tr>
-        <w:tc>
-          <w:tcPr>
-            <w:tcW w:type="dxa" w:w="3969"/>
-          </w:tcPr>
-          <w:p>
-            <w:pPr>
-              <w:jc w:val="left"/>
-            </w:pPr>
-            <w:r/>
-            <w:r>
-              <w:rPr>
-                <w:rFonts w:ascii="Times New Roman" w:hAnsi="Times New Roman"/>
-                <w:sz w:val="22"/>
-              </w:rPr>
-              <w:t>ulasan</w:t>
-            </w:r>
-          </w:p>
-        </w:tc>
-        <w:tc>
-          <w:tcPr>
-            <w:tcW w:type="dxa" w:w="2268"/>
-          </w:tcPr>
-          <w:p>
-            <w:pPr>
-              <w:jc w:val="left"/>
-            </w:pPr>
-            <w:r/>
-            <w:r>
-              <w:rPr>
-                <w:rFonts w:ascii="Times New Roman" w:hAnsi="Times New Roman"/>
-                <w:sz w:val="22"/>
-              </w:rPr>
-              <w:t>6.811</w:t>
-            </w:r>
-          </w:p>
-        </w:tc>
-      </w:tr>
-      <w:tr>
-        <w:tc>
-          <w:tcPr>
-            <w:tcW w:type="dxa" w:w="3969"/>
-          </w:tcPr>
-          <w:p>
-            <w:pPr>
-              <w:jc w:val="left"/>
-            </w:pPr>
-            <w:r/>
-            <w:r>
-              <w:rPr>
-                <w:rFonts w:ascii="Times New Roman" w:hAnsi="Times New Roman"/>
-                <w:sz w:val="22"/>
-              </w:rPr>
-              <w:t>pemetaan_menu_bahan</w:t>
-            </w:r>
-          </w:p>
-        </w:tc>
-        <w:tc>
-          <w:tcPr>
-            <w:tcW w:type="dxa" w:w="2268"/>
-          </w:tcPr>
-          <w:p>
-            <w:pPr>
-              <w:jc w:val="left"/>
-            </w:pPr>
-            <w:r/>
-            <w:r>
-              <w:rPr>
-                <w:rFonts w:ascii="Times New Roman" w:hAnsi="Times New Roman"/>
-                <w:sz w:val="22"/>
-              </w:rPr>
-              <w:t>960</w:t>
-            </w:r>
-          </w:p>
-        </w:tc>
-      </w:tr>
-      <w:tr>
-        <w:tc>
-          <w:tcPr>
-            <w:tcW w:type="dxa" w:w="3969"/>
-          </w:tcPr>
-          <w:p>
-            <w:pPr>
-              <w:jc w:val="left"/>
-            </w:pPr>
-            <w:r/>
-            <w:r>
-              <w:rPr>
-                <w:rFonts w:ascii="Times New Roman" w:hAnsi="Times New Roman"/>
-                <w:sz w:val="22"/>
-              </w:rPr>
-              <w:t>pemetaan_menu</w:t>
-            </w:r>
-          </w:p>
-        </w:tc>
-        <w:tc>
-          <w:tcPr>
-            <w:tcW w:type="dxa" w:w="2268"/>
-          </w:tcPr>
-          <w:p>
-            <w:pPr>
-              <w:jc w:val="left"/>
-            </w:pPr>
-            <w:r/>
-            <w:r>
-              <w:rPr>
-                <w:rFonts w:ascii="Times New Roman" w:hAnsi="Times New Roman"/>
-                <w:sz w:val="22"/>
-              </w:rPr>
-              <w:t>960</w:t>
-            </w:r>
-          </w:p>
-        </w:tc>
-      </w:tr>
-      <w:tr>
-        <w:tc>
-          <w:tcPr>
-            <w:tcW w:type="dxa" w:w="3969"/>
-          </w:tcPr>
-          <w:p>
-            <w:pPr>
-              <w:jc w:val="left"/>
-            </w:pPr>
-            <w:r/>
-            <w:r>
-              <w:rPr>
-                <w:rFonts w:ascii="Times New Roman" w:hAnsi="Times New Roman"/>
-                <w:sz w:val="22"/>
-              </w:rPr>
-              <w:t>kemasan</w:t>
-            </w:r>
-          </w:p>
-        </w:tc>
-        <w:tc>
-          <w:tcPr>
-            <w:tcW w:type="dxa" w:w="2268"/>
-          </w:tcPr>
-          <w:p>
-            <w:pPr>
-              <w:jc w:val="left"/>
-            </w:pPr>
-            <w:r/>
-            <w:r>
-              <w:rPr>
-                <w:rFonts w:ascii="Times New Roman" w:hAnsi="Times New Roman"/>
-                <w:sz w:val="22"/>
-              </w:rPr>
-              <w:t>960</w:t>
-            </w:r>
-          </w:p>
-        </w:tc>
-      </w:tr>
-      <w:tr>
-        <w:tc>
-          <w:tcPr>
-            <w:tcW w:type="dxa" w:w="3969"/>
-          </w:tcPr>
-          <w:p>
-            <w:pPr>
-              <w:jc w:val="left"/>
-            </w:pPr>
-            <w:r/>
-            <w:r>
-              <w:rPr>
-                <w:rFonts w:ascii="Times New Roman" w:hAnsi="Times New Roman"/>
-                <w:sz w:val="22"/>
-              </w:rPr>
-              <w:t>barang</w:t>
-            </w:r>
-          </w:p>
-        </w:tc>
-        <w:tc>
-          <w:tcPr>
-            <w:tcW w:type="dxa" w:w="2268"/>
-          </w:tcPr>
-          <w:p>
-            <w:pPr>
-              <w:jc w:val="left"/>
-            </w:pPr>
-            <w:r/>
-            <w:r>
-              <w:rPr>
-                <w:rFonts w:ascii="Times New Roman" w:hAnsi="Times New Roman"/>
-                <w:sz w:val="22"/>
-              </w:rPr>
-              <w:t>960</w:t>
+              <w:t>408</w:t>
             </w:r>
           </w:p>
         </w:tc>
@@ -10126,7 +9632,7 @@
                 <w:rFonts w:ascii="Times New Roman" w:hAnsi="Times New Roman"/>
                 <w:sz w:val="22"/>
               </w:rPr>
-              <w:t>1.383</w:t>
+              <w:t>1.383 *</w:t>
             </w:r>
           </w:p>
         </w:tc>
@@ -10218,7 +9724,7 @@
                 <w:rFonts w:ascii="Times New Roman" w:hAnsi="Times New Roman"/>
                 <w:sz w:val="22"/>
               </w:rPr>
-              <w:t>1.383</w:t>
+              <w:t>1.383 *</w:t>
             </w:r>
           </w:p>
         </w:tc>
@@ -10310,7 +9816,7 @@
                 <w:rFonts w:ascii="Times New Roman" w:hAnsi="Times New Roman"/>
                 <w:sz w:val="22"/>
               </w:rPr>
-              <w:t>1.420</w:t>
+              <w:t>1.414 ± 10 *</w:t>
             </w:r>
           </w:p>
         </w:tc>
@@ -10402,7 +9908,7 @@
                 <w:rFonts w:ascii="Times New Roman" w:hAnsi="Times New Roman"/>
                 <w:sz w:val="22"/>
               </w:rPr>
-              <w:t>1.432</w:t>
+              <w:t>1.442 ± 16 *</w:t>
             </w:r>
           </w:p>
         </w:tc>
@@ -10620,7 +10126,7 @@
                 <w:rFonts w:ascii="Times New Roman" w:hAnsi="Times New Roman"/>
                 <w:sz w:val="22"/>
               </w:rPr>
-              <w:t>1.498</w:t>
+              <w:t>1.465 ± 26 *</w:t>
             </w:r>
           </w:p>
         </w:tc>
@@ -10712,7 +10218,7 @@
                 <w:rFonts w:ascii="Times New Roman" w:hAnsi="Times New Roman"/>
                 <w:sz w:val="22"/>
               </w:rPr>
-              <w:t>1.550</w:t>
+              <w:t>1.550 *</w:t>
             </w:r>
           </w:p>
         </w:tc>
@@ -10804,43 +10310,693 @@
                 <w:rFonts w:ascii="Times New Roman" w:hAnsi="Times New Roman"/>
                 <w:sz w:val="22"/>
               </w:rPr>
+              <w:t>1.551 *</w:t>
+            </w:r>
+          </w:p>
+        </w:tc>
+        <w:tc>
+          <w:tcPr>
+            <w:tcW w:type="dxa" w:w="1701"/>
+          </w:tcPr>
+          <w:p>
+            <w:pPr>
+              <w:jc w:val="left"/>
+            </w:pPr>
+            <w:r/>
+            <w:r>
+              <w:rPr>
+                <w:rFonts w:ascii="Times New Roman" w:hAnsi="Times New Roman"/>
+                <w:sz w:val="22"/>
+              </w:rPr>
+              <w:t>0,1663</w:t>
+            </w:r>
+          </w:p>
+        </w:tc>
+        <w:tc>
+          <w:tcPr>
+            <w:tcW w:type="dxa" w:w="1134"/>
+          </w:tcPr>
+          <w:p>
+            <w:pPr>
+              <w:jc w:val="left"/>
+            </w:pPr>
+            <w:r/>
+            <w:r>
+              <w:rPr>
+                <w:rFonts w:ascii="Times New Roman" w:hAnsi="Times New Roman"/>
+                <w:sz w:val="22"/>
+              </w:rPr>
+              <w:t>0,768</w:t>
+            </w:r>
+          </w:p>
+        </w:tc>
+        <w:tc>
+          <w:tcPr>
+            <w:tcW w:type="dxa" w:w="1361"/>
+          </w:tcPr>
+          <w:p>
+            <w:pPr>
+              <w:jc w:val="left"/>
+            </w:pPr>
+            <w:r/>
+            <w:r>
+              <w:rPr>
+                <w:rFonts w:ascii="Times New Roman" w:hAnsi="Times New Roman"/>
+                <w:sz w:val="22"/>
+              </w:rPr>
+              <w:t>1,0327</w:t>
+            </w:r>
+          </w:p>
+        </w:tc>
+      </w:tr>
+    </w:tbl>
+    <w:p/>
+    <w:p>
+      <w:pPr>
+        <w:jc w:val="both"/>
+      </w:pPr>
+      <w:r>
+        <w:rPr>
+          <w:rFonts w:ascii="Times New Roman" w:hAnsi="Times New Roman"/>
+          <w:b w:val="0"/>
+          <w:sz w:val="24"/>
+        </w:rPr>
+        <w:t>* Regret total rata-rata 10 benih ± simpangan baku; kolom lain dari satu benih.</w:t>
+      </w:r>
+    </w:p>
+    <w:p>
+      <w:pPr>
+        <w:jc w:val="both"/>
+      </w:pPr>
+      <w:r>
+        <w:rPr>
+          <w:rFonts w:ascii="Times New Roman" w:hAnsi="Times New Roman"/>
+          <w:b/>
+          <w:sz w:val="24"/>
+        </w:rPr>
+        <w:t>Ulangan dengan 10 benih acak</w:t>
+      </w:r>
+    </w:p>
+    <w:p>
+      <w:pPr>
+        <w:jc w:val="both"/>
+      </w:pPr>
+      <w:r>
+        <w:rPr>
+          <w:rFonts w:ascii="Times New Roman" w:hAnsi="Times New Roman"/>
+          <w:b w:val="0"/>
+          <w:sz w:val="24"/>
+        </w:rPr>
+        <w:t>Tabel per sumbu di atas berasal dari satu benih acak. Benih itu ikut menentukan cuplikan Thompson dan lemparan epsilon-greedy, sehingga selisih kecil antar kebijakan bisa hanya derau. Karena itu simulasi diulang dengan 10 benih; angka di bawah ini yang dipakai sebagai angka resmi tiap kebijakan. Kebijakan tanpa unsur acak (greedy, LinUCB, TOPSIS) memberi angka yang sama di semua benih.</w:t>
+      </w:r>
+    </w:p>
+    <w:tbl>
+      <w:tblPr>
+        <w:tblStyle w:val="LightGrid-Accent1"/>
+        <w:tblW w:type="auto" w:w="0"/>
+        <w:jc w:val="center"/>
+        <w:tblLook w:firstColumn="1" w:firstRow="1" w:lastColumn="0" w:lastRow="0" w:noHBand="0" w:noVBand="1" w:val="04A0"/>
+      </w:tblPr>
+      <w:tblGrid>
+        <w:gridCol w:w="2280"/>
+        <w:gridCol w:w="2280"/>
+        <w:gridCol w:w="2280"/>
+        <w:gridCol w:w="2280"/>
+      </w:tblGrid>
+      <w:tr>
+        <w:tc>
+          <w:tcPr>
+            <w:tcW w:type="dxa" w:w="3175"/>
+          </w:tcPr>
+          <w:p>
+            <w:pPr>
+              <w:jc w:val="left"/>
+            </w:pPr>
+            <w:r/>
+            <w:r>
+              <w:rPr>
+                <w:rFonts w:ascii="Times New Roman" w:hAnsi="Times New Roman"/>
+                <w:b/>
+                <w:sz w:val="22"/>
+              </w:rPr>
+              <w:t>Kebijakan</w:t>
+            </w:r>
+          </w:p>
+        </w:tc>
+        <w:tc>
+          <w:tcPr>
+            <w:tcW w:type="dxa" w:w="2268"/>
+          </w:tcPr>
+          <w:p>
+            <w:pPr>
+              <w:jc w:val="left"/>
+            </w:pPr>
+            <w:r/>
+            <w:r>
+              <w:rPr>
+                <w:rFonts w:ascii="Times New Roman" w:hAnsi="Times New Roman"/>
+                <w:b/>
+                <w:sz w:val="22"/>
+              </w:rPr>
+              <w:t>Regret total (rata-rata ± sd)</w:t>
+            </w:r>
+          </w:p>
+        </w:tc>
+        <w:tc>
+          <w:tcPr>
+            <w:tcW w:type="dxa" w:w="1814"/>
+          </w:tcPr>
+          <w:p>
+            <w:pPr>
+              <w:jc w:val="left"/>
+            </w:pPr>
+            <w:r/>
+            <w:r>
+              <w:rPr>
+                <w:rFonts w:ascii="Times New Roman" w:hAnsi="Times New Roman"/>
+                <w:b/>
+                <w:sz w:val="22"/>
+              </w:rPr>
+              <w:t>Selang 95%</w:t>
+            </w:r>
+          </w:p>
+        </w:tc>
+        <w:tc>
+          <w:tcPr>
+            <w:tcW w:type="dxa" w:w="1361"/>
+          </w:tcPr>
+          <w:p>
+            <w:pPr>
+              <w:jc w:val="left"/>
+            </w:pPr>
+            <w:r/>
+            <w:r>
+              <w:rPr>
+                <w:rFonts w:ascii="Times New Roman" w:hAnsi="Times New Roman"/>
+                <w:b/>
+                <w:sz w:val="22"/>
+              </w:rPr>
+              <w:t>Rasio harga</w:t>
+            </w:r>
+          </w:p>
+        </w:tc>
+      </w:tr>
+      <w:tr>
+        <w:tc>
+          <w:tcPr>
+            <w:tcW w:type="dxa" w:w="3175"/>
+          </w:tcPr>
+          <w:p>
+            <w:pPr>
+              <w:jc w:val="left"/>
+            </w:pPr>
+            <w:r/>
+            <w:r>
+              <w:rPr>
+                <w:rFonts w:ascii="Times New Roman" w:hAnsi="Times New Roman"/>
+                <w:sz w:val="22"/>
+              </w:rPr>
+              <w:t>Greedy</w:t>
+            </w:r>
+          </w:p>
+        </w:tc>
+        <w:tc>
+          <w:tcPr>
+            <w:tcW w:type="dxa" w:w="2268"/>
+          </w:tcPr>
+          <w:p>
+            <w:pPr>
+              <w:jc w:val="left"/>
+            </w:pPr>
+            <w:r/>
+            <w:r>
+              <w:rPr>
+                <w:rFonts w:ascii="Times New Roman" w:hAnsi="Times New Roman"/>
+                <w:sz w:val="22"/>
+              </w:rPr>
+              <w:t>1.383</w:t>
+            </w:r>
+          </w:p>
+        </w:tc>
+        <w:tc>
+          <w:tcPr>
+            <w:tcW w:type="dxa" w:w="1814"/>
+          </w:tcPr>
+          <w:p>
+            <w:pPr>
+              <w:jc w:val="left"/>
+            </w:pPr>
+            <w:r/>
+            <w:r>
+              <w:rPr>
+                <w:rFonts w:ascii="Times New Roman" w:hAnsi="Times New Roman"/>
+                <w:sz w:val="22"/>
+              </w:rPr>
+              <w:t>deterministik</w:t>
+            </w:r>
+          </w:p>
+        </w:tc>
+        <w:tc>
+          <w:tcPr>
+            <w:tcW w:type="dxa" w:w="1361"/>
+          </w:tcPr>
+          <w:p>
+            <w:pPr>
+              <w:jc w:val="left"/>
+            </w:pPr>
+            <w:r/>
+            <w:r>
+              <w:rPr>
+                <w:rFonts w:ascii="Times New Roman" w:hAnsi="Times New Roman"/>
+                <w:sz w:val="22"/>
+              </w:rPr>
+              <w:t>1,051</w:t>
+            </w:r>
+          </w:p>
+        </w:tc>
+      </w:tr>
+      <w:tr>
+        <w:tc>
+          <w:tcPr>
+            <w:tcW w:type="dxa" w:w="3175"/>
+          </w:tcPr>
+          <w:p>
+            <w:pPr>
+              <w:jc w:val="left"/>
+            </w:pPr>
+            <w:r/>
+            <w:r>
+              <w:rPr>
+                <w:rFonts w:ascii="Times New Roman" w:hAnsi="Times New Roman"/>
+                <w:sz w:val="22"/>
+              </w:rPr>
+              <w:t>LinUCB (alfa 1)</w:t>
+            </w:r>
+          </w:p>
+        </w:tc>
+        <w:tc>
+          <w:tcPr>
+            <w:tcW w:type="dxa" w:w="2268"/>
+          </w:tcPr>
+          <w:p>
+            <w:pPr>
+              <w:jc w:val="left"/>
+            </w:pPr>
+            <w:r/>
+            <w:r>
+              <w:rPr>
+                <w:rFonts w:ascii="Times New Roman" w:hAnsi="Times New Roman"/>
+                <w:sz w:val="22"/>
+              </w:rPr>
+              <w:t>1.383</w:t>
+            </w:r>
+          </w:p>
+        </w:tc>
+        <w:tc>
+          <w:tcPr>
+            <w:tcW w:type="dxa" w:w="1814"/>
+          </w:tcPr>
+          <w:p>
+            <w:pPr>
+              <w:jc w:val="left"/>
+            </w:pPr>
+            <w:r/>
+            <w:r>
+              <w:rPr>
+                <w:rFonts w:ascii="Times New Roman" w:hAnsi="Times New Roman"/>
+                <w:sz w:val="22"/>
+              </w:rPr>
+              <w:t>deterministik</w:t>
+            </w:r>
+          </w:p>
+        </w:tc>
+        <w:tc>
+          <w:tcPr>
+            <w:tcW w:type="dxa" w:w="1361"/>
+          </w:tcPr>
+          <w:p>
+            <w:pPr>
+              <w:jc w:val="left"/>
+            </w:pPr>
+            <w:r/>
+            <w:r>
+              <w:rPr>
+                <w:rFonts w:ascii="Times New Roman" w:hAnsi="Times New Roman"/>
+                <w:sz w:val="22"/>
+              </w:rPr>
+              <w:t>1,051</w:t>
+            </w:r>
+          </w:p>
+        </w:tc>
+      </w:tr>
+      <w:tr>
+        <w:tc>
+          <w:tcPr>
+            <w:tcW w:type="dxa" w:w="3175"/>
+          </w:tcPr>
+          <w:p>
+            <w:pPr>
+              <w:jc w:val="left"/>
+            </w:pPr>
+            <w:r/>
+            <w:r>
+              <w:rPr>
+                <w:rFonts w:ascii="Times New Roman" w:hAnsi="Times New Roman"/>
+                <w:sz w:val="22"/>
+              </w:rPr>
+              <w:t>Thompson</w:t>
+            </w:r>
+          </w:p>
+        </w:tc>
+        <w:tc>
+          <w:tcPr>
+            <w:tcW w:type="dxa" w:w="2268"/>
+          </w:tcPr>
+          <w:p>
+            <w:pPr>
+              <w:jc w:val="left"/>
+            </w:pPr>
+            <w:r/>
+            <w:r>
+              <w:rPr>
+                <w:rFonts w:ascii="Times New Roman" w:hAnsi="Times New Roman"/>
+                <w:sz w:val="22"/>
+              </w:rPr>
+              <w:t>1.414 ± 10</w:t>
+            </w:r>
+          </w:p>
+        </w:tc>
+        <w:tc>
+          <w:tcPr>
+            <w:tcW w:type="dxa" w:w="1814"/>
+          </w:tcPr>
+          <w:p>
+            <w:pPr>
+              <w:jc w:val="left"/>
+            </w:pPr>
+            <w:r/>
+            <w:r>
+              <w:rPr>
+                <w:rFonts w:ascii="Times New Roman" w:hAnsi="Times New Roman"/>
+                <w:sz w:val="22"/>
+              </w:rPr>
+              <w:t>1.407–1.422</w:t>
+            </w:r>
+          </w:p>
+        </w:tc>
+        <w:tc>
+          <w:tcPr>
+            <w:tcW w:type="dxa" w:w="1361"/>
+          </w:tcPr>
+          <w:p>
+            <w:pPr>
+              <w:jc w:val="left"/>
+            </w:pPr>
+            <w:r/>
+            <w:r>
+              <w:rPr>
+                <w:rFonts w:ascii="Times New Roman" w:hAnsi="Times New Roman"/>
+                <w:sz w:val="22"/>
+              </w:rPr>
+              <w:t>1,054</w:t>
+            </w:r>
+          </w:p>
+        </w:tc>
+      </w:tr>
+      <w:tr>
+        <w:tc>
+          <w:tcPr>
+            <w:tcW w:type="dxa" w:w="3175"/>
+          </w:tcPr>
+          <w:p>
+            <w:pPr>
+              <w:jc w:val="left"/>
+            </w:pPr>
+            <w:r/>
+            <w:r>
+              <w:rPr>
+                <w:rFonts w:ascii="Times New Roman" w:hAnsi="Times New Roman"/>
+                <w:sz w:val="22"/>
+              </w:rPr>
+              <w:t>Epsilon-greedy 0,1</w:t>
+            </w:r>
+          </w:p>
+        </w:tc>
+        <w:tc>
+          <w:tcPr>
+            <w:tcW w:type="dxa" w:w="2268"/>
+          </w:tcPr>
+          <w:p>
+            <w:pPr>
+              <w:jc w:val="left"/>
+            </w:pPr>
+            <w:r/>
+            <w:r>
+              <w:rPr>
+                <w:rFonts w:ascii="Times New Roman" w:hAnsi="Times New Roman"/>
+                <w:sz w:val="22"/>
+              </w:rPr>
+              <w:t>1.442 ± 16</w:t>
+            </w:r>
+          </w:p>
+        </w:tc>
+        <w:tc>
+          <w:tcPr>
+            <w:tcW w:type="dxa" w:w="1814"/>
+          </w:tcPr>
+          <w:p>
+            <w:pPr>
+              <w:jc w:val="left"/>
+            </w:pPr>
+            <w:r/>
+            <w:r>
+              <w:rPr>
+                <w:rFonts w:ascii="Times New Roman" w:hAnsi="Times New Roman"/>
+                <w:sz w:val="22"/>
+              </w:rPr>
+              <w:t>1.431–1.454</w:t>
+            </w:r>
+          </w:p>
+        </w:tc>
+        <w:tc>
+          <w:tcPr>
+            <w:tcW w:type="dxa" w:w="1361"/>
+          </w:tcPr>
+          <w:p>
+            <w:pPr>
+              <w:jc w:val="left"/>
+            </w:pPr>
+            <w:r/>
+            <w:r>
+              <w:rPr>
+                <w:rFonts w:ascii="Times New Roman" w:hAnsi="Times New Roman"/>
+                <w:sz w:val="22"/>
+              </w:rPr>
+              <w:t>1,052</w:t>
+            </w:r>
+          </w:p>
+        </w:tc>
+      </w:tr>
+      <w:tr>
+        <w:tc>
+          <w:tcPr>
+            <w:tcW w:type="dxa" w:w="3175"/>
+          </w:tcPr>
+          <w:p>
+            <w:pPr>
+              <w:jc w:val="left"/>
+            </w:pPr>
+            <w:r/>
+            <w:r>
+              <w:rPr>
+                <w:rFonts w:ascii="Times New Roman" w:hAnsi="Times New Roman"/>
+                <w:sz w:val="22"/>
+              </w:rPr>
+              <w:t>Thompson + fuzzy (produksi)</w:t>
+            </w:r>
+          </w:p>
+        </w:tc>
+        <w:tc>
+          <w:tcPr>
+            <w:tcW w:type="dxa" w:w="2268"/>
+          </w:tcPr>
+          <w:p>
+            <w:pPr>
+              <w:jc w:val="left"/>
+            </w:pPr>
+            <w:r/>
+            <w:r>
+              <w:rPr>
+                <w:rFonts w:ascii="Times New Roman" w:hAnsi="Times New Roman"/>
+                <w:sz w:val="22"/>
+              </w:rPr>
+              <w:t>1.465 ± 26</w:t>
+            </w:r>
+          </w:p>
+        </w:tc>
+        <w:tc>
+          <w:tcPr>
+            <w:tcW w:type="dxa" w:w="1814"/>
+          </w:tcPr>
+          <w:p>
+            <w:pPr>
+              <w:jc w:val="left"/>
+            </w:pPr>
+            <w:r/>
+            <w:r>
+              <w:rPr>
+                <w:rFonts w:ascii="Times New Roman" w:hAnsi="Times New Roman"/>
+                <w:sz w:val="22"/>
+              </w:rPr>
+              <w:t>1.447–1.484</w:t>
+            </w:r>
+          </w:p>
+        </w:tc>
+        <w:tc>
+          <w:tcPr>
+            <w:tcW w:type="dxa" w:w="1361"/>
+          </w:tcPr>
+          <w:p>
+            <w:pPr>
+              <w:jc w:val="left"/>
+            </w:pPr>
+            <w:r/>
+            <w:r>
+              <w:rPr>
+                <w:rFonts w:ascii="Times New Roman" w:hAnsi="Times New Roman"/>
+                <w:sz w:val="22"/>
+              </w:rPr>
+              <w:t>1,044</w:t>
+            </w:r>
+          </w:p>
+        </w:tc>
+      </w:tr>
+      <w:tr>
+        <w:tc>
+          <w:tcPr>
+            <w:tcW w:type="dxa" w:w="3175"/>
+          </w:tcPr>
+          <w:p>
+            <w:pPr>
+              <w:jc w:val="left"/>
+            </w:pPr>
+            <w:r/>
+            <w:r>
+              <w:rPr>
+                <w:rFonts w:ascii="Times New Roman" w:hAnsi="Times New Roman"/>
+                <w:sz w:val="22"/>
+              </w:rPr>
+              <w:t>Greedy + fuzzy</w:t>
+            </w:r>
+          </w:p>
+        </w:tc>
+        <w:tc>
+          <w:tcPr>
+            <w:tcW w:type="dxa" w:w="2268"/>
+          </w:tcPr>
+          <w:p>
+            <w:pPr>
+              <w:jc w:val="left"/>
+            </w:pPr>
+            <w:r/>
+            <w:r>
+              <w:rPr>
+                <w:rFonts w:ascii="Times New Roman" w:hAnsi="Times New Roman"/>
+                <w:sz w:val="22"/>
+              </w:rPr>
+              <w:t>1.550</w:t>
+            </w:r>
+          </w:p>
+        </w:tc>
+        <w:tc>
+          <w:tcPr>
+            <w:tcW w:type="dxa" w:w="1814"/>
+          </w:tcPr>
+          <w:p>
+            <w:pPr>
+              <w:jc w:val="left"/>
+            </w:pPr>
+            <w:r/>
+            <w:r>
+              <w:rPr>
+                <w:rFonts w:ascii="Times New Roman" w:hAnsi="Times New Roman"/>
+                <w:sz w:val="22"/>
+              </w:rPr>
+              <w:t>deterministik</w:t>
+            </w:r>
+          </w:p>
+        </w:tc>
+        <w:tc>
+          <w:tcPr>
+            <w:tcW w:type="dxa" w:w="1361"/>
+          </w:tcPr>
+          <w:p>
+            <w:pPr>
+              <w:jc w:val="left"/>
+            </w:pPr>
+            <w:r/>
+            <w:r>
+              <w:rPr>
+                <w:rFonts w:ascii="Times New Roman" w:hAnsi="Times New Roman"/>
+                <w:sz w:val="22"/>
+              </w:rPr>
+              <w:t>1,043</w:t>
+            </w:r>
+          </w:p>
+        </w:tc>
+      </w:tr>
+      <w:tr>
+        <w:tc>
+          <w:tcPr>
+            <w:tcW w:type="dxa" w:w="3175"/>
+          </w:tcPr>
+          <w:p>
+            <w:pPr>
+              <w:jc w:val="left"/>
+            </w:pPr>
+            <w:r/>
+            <w:r>
+              <w:rPr>
+                <w:rFonts w:ascii="Times New Roman" w:hAnsi="Times New Roman"/>
+                <w:sz w:val="22"/>
+              </w:rPr>
+              <w:t>TOPSIS</w:t>
+            </w:r>
+          </w:p>
+        </w:tc>
+        <w:tc>
+          <w:tcPr>
+            <w:tcW w:type="dxa" w:w="2268"/>
+          </w:tcPr>
+          <w:p>
+            <w:pPr>
+              <w:jc w:val="left"/>
+            </w:pPr>
+            <w:r/>
+            <w:r>
+              <w:rPr>
+                <w:rFonts w:ascii="Times New Roman" w:hAnsi="Times New Roman"/>
+                <w:sz w:val="22"/>
+              </w:rPr>
               <w:t>1.551</w:t>
             </w:r>
           </w:p>
         </w:tc>
         <w:tc>
           <w:tcPr>
-            <w:tcW w:type="dxa" w:w="1701"/>
-          </w:tcPr>
-          <w:p>
-            <w:pPr>
-              <w:jc w:val="left"/>
-            </w:pPr>
-            <w:r/>
-            <w:r>
-              <w:rPr>
-                <w:rFonts w:ascii="Times New Roman" w:hAnsi="Times New Roman"/>
-                <w:sz w:val="22"/>
-              </w:rPr>
-              <w:t>0,1663</w:t>
-            </w:r>
-          </w:p>
-        </w:tc>
-        <w:tc>
-          <w:tcPr>
-            <w:tcW w:type="dxa" w:w="1134"/>
-          </w:tcPr>
-          <w:p>
-            <w:pPr>
-              <w:jc w:val="left"/>
-            </w:pPr>
-            <w:r/>
-            <w:r>
-              <w:rPr>
-                <w:rFonts w:ascii="Times New Roman" w:hAnsi="Times New Roman"/>
-                <w:sz w:val="22"/>
-              </w:rPr>
-              <w:t>0,768</w:t>
+            <w:tcW w:type="dxa" w:w="1814"/>
+          </w:tcPr>
+          <w:p>
+            <w:pPr>
+              <w:jc w:val="left"/>
+            </w:pPr>
+            <w:r/>
+            <w:r>
+              <w:rPr>
+                <w:rFonts w:ascii="Times New Roman" w:hAnsi="Times New Roman"/>
+                <w:sz w:val="22"/>
+              </w:rPr>
+              <w:t>deterministik</w:t>
             </w:r>
           </w:p>
         </w:tc>
@@ -10858,7 +11014,7 @@
                 <w:rFonts w:ascii="Times New Roman" w:hAnsi="Times New Roman"/>
                 <w:sz w:val="22"/>
               </w:rPr>
-              <w:t>1,0327</w:t>
+              <w:t>1,033</w:t>
             </w:r>
           </w:p>
         </w:tc>
@@ -11021,7 +11177,7 @@
           <w:b w:val="0"/>
           <w:sz w:val="24"/>
         </w:rPr>
-        <w:t>Pada penaksir Beta yang diperbarui setiap pesanan, greedy murni mendapat regret 1.383, Thompson 1.420, LinUCB 1.383, epsilon-greedy 1.432. Penjelasannya: reputasi tiap distributor dipakai bersama oleh seluruh UMKM, sehingga dalam beberapa pekan pertama setiap distributor sudah punya ratusan pesanan dan ketidakpastiannya hampir habis. Greedy dan LinUCB hanya berbeda pilihan pada segelintir keputusan; Thompson berbeda dari greedy pada sekitar 4 persen keputusan.</w:t>
+        <w:t>Pada penaksir Beta yang diperbarui setiap pesanan, greedy murni mendapat regret 1.383, Thompson 1.414 ± 10, LinUCB 1.383, epsilon-greedy 1.442 ± 16. Penjelasannya: reputasi tiap distributor dipakai bersama oleh seluruh UMKM, sehingga dalam beberapa pekan pertama setiap distributor sudah punya ratusan pesanan dan ketidakpastiannya hampir habis. Greedy dan LinUCB hanya berbeda pilihan pada segelintir keputusan; Thompson berbeda dari greedy pada sekitar 4 persen keputusan.</w:t>
       </w:r>
     </w:p>
     <w:p>
@@ -11055,7 +11211,7 @@
           <w:b w:val="0"/>
           <w:sz w:val="24"/>
         </w:rPr>
-        <w:t>TOPSIS adalah pembanding pengambilan keputusan multikriteria yang lazim. Ia tidak belajar dari hasil pesanan; bobotnya tetap. Fuzzy di atas Beta+Thompson mencapai regret 1.498 melawan 1.551 untuk TOPSIS, dengan rasio harga 1,0424 melawan 1,0327 — lebih andal dengan harga yang hanya sedikit lebih mahal. Keduanya sengaja menukar sebagian keandalan dengan harga, sehingga regretnya lebih besar daripada kebijakan yang hanya mengejar keandalan (Gambar 8).</w:t>
+        <w:t>TOPSIS adalah pembanding pengambilan keputusan multikriteria yang lazim. Ia tidak belajar dari hasil pesanan; bobotnya tetap. Fuzzy di atas Beta+Thompson mencapai regret 1.465 ± 26 melawan 1.551 untuk TOPSIS, dengan rasio harga 1,0442 melawan 1,0327 — lebih andal dengan harga yang hanya sedikit lebih mahal. Keduanya sengaja menukar sebagian keandalan dengan harga, sehingga regretnya lebih besar daripada kebijakan yang hanya mengejar keandalan (Gambar 8).</w:t>
       </w:r>
     </w:p>
     <w:p>
@@ -11320,7 +11476,7 @@
                 <w:rFonts w:ascii="Times New Roman" w:hAnsi="Times New Roman"/>
                 <w:sz w:val="22"/>
               </w:rPr>
-              <w:t>0,765</w:t>
+              <w:t>0,691</w:t>
             </w:r>
           </w:p>
         </w:tc>
@@ -11394,7 +11550,7 @@
                 <w:rFonts w:ascii="Times New Roman" w:hAnsi="Times New Roman"/>
                 <w:sz w:val="22"/>
               </w:rPr>
-              <w:t>0,547</w:t>
+              <w:t>0,696</w:t>
             </w:r>
           </w:p>
         </w:tc>
@@ -11450,7 +11606,7 @@
                 <w:rFonts w:ascii="Times New Roman" w:hAnsi="Times New Roman"/>
                 <w:sz w:val="22"/>
               </w:rPr>
-              <w:t>3</w:t>
+              <w:t>4</w:t>
             </w:r>
           </w:p>
         </w:tc>
@@ -11468,7 +11624,7 @@
                 <w:rFonts w:ascii="Times New Roman" w:hAnsi="Times New Roman"/>
                 <w:sz w:val="22"/>
               </w:rPr>
-              <w:t>0,633</w:t>
+              <w:t>0,652</w:t>
             </w:r>
           </w:p>
         </w:tc>
@@ -11542,7 +11698,7 @@
                 <w:rFonts w:ascii="Times New Roman" w:hAnsi="Times New Roman"/>
                 <w:sz w:val="22"/>
               </w:rPr>
-              <w:t>0,649</w:t>
+              <w:t>0,705</w:t>
             </w:r>
           </w:p>
         </w:tc>
@@ -11616,7 +11772,7 @@
                 <w:rFonts w:ascii="Times New Roman" w:hAnsi="Times New Roman"/>
                 <w:sz w:val="22"/>
               </w:rPr>
-              <w:t>0,453</w:t>
+              <w:t>0,492</w:t>
             </w:r>
           </w:p>
         </w:tc>
@@ -11690,7 +11846,7 @@
                 <w:rFonts w:ascii="Times New Roman" w:hAnsi="Times New Roman"/>
                 <w:sz w:val="22"/>
               </w:rPr>
-              <w:t>0,653</w:t>
+              <w:t>0,676</w:t>
             </w:r>
           </w:p>
         </w:tc>
@@ -11746,7 +11902,7 @@
                 <w:rFonts w:ascii="Times New Roman" w:hAnsi="Times New Roman"/>
                 <w:sz w:val="22"/>
               </w:rPr>
-              <w:t>5</w:t>
+              <w:t>4</w:t>
             </w:r>
           </w:p>
         </w:tc>
@@ -11764,7 +11920,7 @@
                 <w:rFonts w:ascii="Times New Roman" w:hAnsi="Times New Roman"/>
                 <w:sz w:val="22"/>
               </w:rPr>
-              <w:t>0,630</w:t>
+              <w:t>0,732</w:t>
             </w:r>
           </w:p>
         </w:tc>
@@ -11820,7 +11976,7 @@
                 <w:rFonts w:ascii="Times New Roman" w:hAnsi="Times New Roman"/>
                 <w:sz w:val="22"/>
               </w:rPr>
-              <w:t>4</w:t>
+              <w:t>3</w:t>
             </w:r>
           </w:p>
         </w:tc>
@@ -11838,7 +11994,7 @@
                 <w:rFonts w:ascii="Times New Roman" w:hAnsi="Times New Roman"/>
                 <w:sz w:val="22"/>
               </w:rPr>
-              <w:t>0,521</w:t>
+              <w:t>0,708</w:t>
             </w:r>
           </w:p>
         </w:tc>
@@ -11946,7 +12102,7 @@
           <w:b w:val="0"/>
           <w:sz w:val="24"/>
         </w:rPr>
-        <w:t>83 uji, semuanya lulus (python -m pytest uji -q).</w:t>
+        <w:t>97 uji, semuanya lulus (python -m pytest uji -q).</w:t>
       </w:r>
     </w:p>
     <w:tbl>

</xml_diff>